<commit_message>
Ispravi orijentaciju stranice (landscape) za sirok Internet marketing plan deo
</commit_message>
<xml_diff>
--- a/internet-marketing-projekat/seminarski-rad/IMDM_Seminarski_rad_SPOJEN.docx
+++ b/internet-marketing-projekat/seminarski-rad/IMDM_Seminarski_rad_SPOJEN.docx
@@ -1659,6 +1659,17 @@
         <w:lastRenderedPageBreak/>
         <w:t>Internet marketing plan</w:t>
       </w:r>
+    </w:p>
+    <w:p>
+      <w:pPr>
+        <w:sectPr>
+          <w:headerReference w:type="default" r:id="rId10"/>
+          <w:pgSz w:w="11906" w:h="16838"/>
+          <w:pgMar w:top="1417" w:right="1417" w:bottom="1417" w:left="1417" w:header="708" w:footer="708" w:gutter="0"/>
+          <w:cols w:space="708"/>
+          <w:docGrid w:linePitch="360"/>
+        </w:sectPr>
+      </w:pPr>
     </w:p>
     <w:tbl>
       <w:tblPr>
@@ -8444,6 +8455,17 @@
         </w:tc>
       </w:tr>
     </w:tbl>
+    <w:p>
+      <w:pPr>
+        <w:sectPr>
+          <w:headerReference w:type="default" r:id="rId10"/>
+          <w:pgSz w:w="16838" w:h="11906" w:orient="landscape"/>
+          <w:pgMar w:top="1417" w:right="1417" w:bottom="1417" w:left="1417" w:header="708" w:footer="708" w:gutter="0"/>
+          <w:cols w:space="708"/>
+          <w:docGrid w:linePitch="360"/>
+        </w:sectPr>
+      </w:pPr>
+    </w:p>
     <w:p>
       <w:pPr>
         <w:spacing w:before="0"/>

</xml_diff>